<commit_message>
Agrega pruebas integrales y cobertura
</commit_message>
<xml_diff>
--- a/docs/MediTurno_Documentacion_Entrega.docx
+++ b/docs/MediTurno_Documentacion_Entrega.docx
@@ -248,7 +248,7 @@
                 <w:b w:val="0"/>
                 <w:sz w:val="19"/>
               </w:rPr>
-              <w:t>mvn clean test: BUILD SUCCESS, 15 pruebas ejecutadas</w:t>
+              <w:t>mvn clean verify: BUILD SUCCESS, 26 pruebas ejecutadas</w:t>
             </w:r>
           </w:p>
         </w:tc>
@@ -263,7 +263,7 @@
         <w:rPr>
           <w:color w:val="52616F"/>
         </w:rPr>
-        <w:t>Incluye diagramas, evidencias del flujo funcional y pruebas pendientes recomendadas.</w:t>
+        <w:t>Incluye diagramas, evidencias del flujo funcional, pruebas automatizadas, cobertura JaCoCo y preparacion SonarQube.</w:t>
       </w:r>
     </w:p>
     <w:p>
@@ -502,7 +502,7 @@
                 <w:b w:val="0"/>
                 <w:sz w:val="19"/>
               </w:rPr>
-              <w:t>15 pruebas en verde con JUnit 5 y Mockito</w:t>
+              <w:t>26 pruebas en verde con JUnit 5, Mockito, MockMvc y H2</w:t>
             </w:r>
           </w:p>
         </w:tc>
@@ -2241,7 +2241,7 @@
       <w:r>
         <w:drawing>
           <wp:inline xmlns:a="http://schemas.openxmlformats.org/drawingml/2006/main" xmlns:pic="http://schemas.openxmlformats.org/drawingml/2006/picture">
-            <wp:extent cx="5715000" cy="2971800"/>
+            <wp:extent cx="5715000" cy="3429000"/>
             <wp:docPr id="6" name="Picture 6"/>
             <wp:cNvGraphicFramePr>
               <a:graphicFrameLocks noChangeAspect="1"/>
@@ -2262,7 +2262,7 @@
                   <pic:spPr>
                     <a:xfrm>
                       <a:off x="0" y="0"/>
-                      <a:ext cx="5715000" cy="2971800"/>
+                      <a:ext cx="5715000" cy="3429000"/>
                     </a:xfrm>
                     <a:prstGeom prst="rect"/>
                   </pic:spPr>
@@ -2283,7 +2283,7 @@
           <w:color w:val="52616F"/>
           <w:sz w:val="18"/>
         </w:rPr>
-        <w:t>Figura 6. Evidencia resumida de mvn clean test.</w:t>
+        <w:t>Figura 6. Evidencia resumida de mvn clean verify.</w:t>
       </w:r>
     </w:p>
     <w:tbl>
@@ -2400,6 +2400,132 @@
                 <w:b w:val="0"/>
                 <w:sz w:val="19"/>
               </w:rPr>
+              <w:t>CitaFlowMockMvcIntegrationTest</w:t>
+            </w:r>
+          </w:p>
+        </w:tc>
+        <w:tc>
+          <w:tcPr>
+            <w:tcW w:type="dxa" w:w="5688"/>
+            <w:vAlign w:val="center"/>
+          </w:tcPr>
+          <w:p>
+            <w:pPr>
+              <w:spacing w:after="0"/>
+            </w:pPr>
+            <w:r/>
+            <w:r>
+              <w:rPr>
+                <w:rFonts w:ascii="Calibri" w:hAnsi="Calibri"/>
+                <w:b w:val="0"/>
+                <w:sz w:val="19"/>
+              </w:rPr>
+              <w:t>Flujo HTTP completo con MockMvc</w:t>
+            </w:r>
+          </w:p>
+        </w:tc>
+      </w:tr>
+      <w:tr>
+        <w:tc>
+          <w:tcPr>
+            <w:tcW w:type="dxa" w:w="3240"/>
+            <w:vAlign w:val="center"/>
+          </w:tcPr>
+          <w:p>
+            <w:pPr>
+              <w:spacing w:after="0"/>
+            </w:pPr>
+            <w:r/>
+            <w:r>
+              <w:rPr>
+                <w:rFonts w:ascii="Calibri" w:hAnsi="Calibri"/>
+                <w:b w:val="0"/>
+                <w:sz w:val="19"/>
+              </w:rPr>
+              <w:t>ControllerResponseMockMvcTest</w:t>
+            </w:r>
+          </w:p>
+        </w:tc>
+        <w:tc>
+          <w:tcPr>
+            <w:tcW w:type="dxa" w:w="5688"/>
+            <w:vAlign w:val="center"/>
+          </w:tcPr>
+          <w:p>
+            <w:pPr>
+              <w:spacing w:after="0"/>
+            </w:pPr>
+            <w:r/>
+            <w:r>
+              <w:rPr>
+                <w:rFonts w:ascii="Calibri" w:hAnsi="Calibri"/>
+                <w:b w:val="0"/>
+                <w:sz w:val="19"/>
+              </w:rPr>
+              <w:t>Respuestas 201, 400, 404 y 204</w:t>
+            </w:r>
+          </w:p>
+        </w:tc>
+      </w:tr>
+      <w:tr>
+        <w:tc>
+          <w:tcPr>
+            <w:tcW w:type="dxa" w:w="3240"/>
+            <w:vAlign w:val="center"/>
+          </w:tcPr>
+          <w:p>
+            <w:pPr>
+              <w:spacing w:after="0"/>
+            </w:pPr>
+            <w:r/>
+            <w:r>
+              <w:rPr>
+                <w:rFonts w:ascii="Calibri" w:hAnsi="Calibri"/>
+                <w:b w:val="0"/>
+                <w:sz w:val="19"/>
+              </w:rPr>
+              <w:t>RepositoryH2Test</w:t>
+            </w:r>
+          </w:p>
+        </w:tc>
+        <w:tc>
+          <w:tcPr>
+            <w:tcW w:type="dxa" w:w="5688"/>
+            <w:vAlign w:val="center"/>
+          </w:tcPr>
+          <w:p>
+            <w:pPr>
+              <w:spacing w:after="0"/>
+            </w:pPr>
+            <w:r/>
+            <w:r>
+              <w:rPr>
+                <w:rFonts w:ascii="Calibri" w:hAnsi="Calibri"/>
+                <w:b w:val="0"/>
+                <w:sz w:val="19"/>
+              </w:rPr>
+              <w:t>Queries reales con H2 para solapamientos, filtros y citas activas</w:t>
+            </w:r>
+          </w:p>
+        </w:tc>
+      </w:tr>
+      <w:tr>
+        <w:tc>
+          <w:tcPr>
+            <w:tcW w:type="dxa" w:w="3240"/>
+            <w:vAlign w:val="center"/>
+          </w:tcPr>
+          <w:p>
+            <w:pPr>
+              <w:spacing w:after="0"/>
+            </w:pPr>
+            <w:r/>
+            <w:r>
+              <w:rPr>
+                <w:rFonts w:ascii="Calibri" w:hAnsi="Calibri"/>
+                <w:b w:val="0"/>
+                <w:sz w:val="19"/>
+              </w:rPr>
               <w:t>CitaServiceTest</w:t>
             </w:r>
           </w:p>
@@ -2421,6 +2547,48 @@
                 <w:sz w:val="19"/>
               </w:rPr>
               <w:t>Agendar, rechazar disponibilidad ocupada, cancelar y reprogramar</w:t>
+            </w:r>
+          </w:p>
+        </w:tc>
+      </w:tr>
+      <w:tr>
+        <w:tc>
+          <w:tcPr>
+            <w:tcW w:type="dxa" w:w="3240"/>
+            <w:vAlign w:val="center"/>
+          </w:tcPr>
+          <w:p>
+            <w:pPr>
+              <w:spacing w:after="0"/>
+            </w:pPr>
+            <w:r/>
+            <w:r>
+              <w:rPr>
+                <w:rFonts w:ascii="Calibri" w:hAnsi="Calibri"/>
+                <w:b w:val="0"/>
+                <w:sz w:val="19"/>
+              </w:rPr>
+              <w:t>ReporteCitasServiceTest</w:t>
+            </w:r>
+          </w:p>
+        </w:tc>
+        <w:tc>
+          <w:tcPr>
+            <w:tcW w:type="dxa" w:w="5688"/>
+            <w:vAlign w:val="center"/>
+          </w:tcPr>
+          <w:p>
+            <w:pPr>
+              <w:spacing w:after="0"/>
+            </w:pPr>
+            <w:r/>
+            <w:r>
+              <w:rPr>
+                <w:rFonts w:ascii="Calibri" w:hAnsi="Calibri"/>
+                <w:b w:val="0"/>
+                <w:sz w:val="19"/>
+              </w:rPr>
+              <w:t>Reporte por rango, filtro por medico y rango invalido</w:t>
             </w:r>
           </w:p>
         </w:tc>
@@ -2558,7 +2726,7 @@
         <w:pStyle w:val="Heading1"/>
       </w:pPr>
       <w:r>
-        <w:t>8. Pruebas pendientes recomendadas</w:t>
+        <w:t>8. Cobertura y analisis de calidad</w:t>
       </w:r>
     </w:p>
     <w:p>
@@ -2566,7 +2734,7 @@
         <w:pStyle w:val="ListBullet"/>
       </w:pPr>
       <w:r>
-        <w:t>Pruebas de integracion HTTP con MockMvc para todo el flujo.</w:t>
+        <w:t>JaCoCo esta configurado en pom.xml mediante jacoco-maven-plugin.</w:t>
       </w:r>
     </w:p>
     <w:p>
@@ -2574,7 +2742,7 @@
         <w:pStyle w:val="ListBullet"/>
       </w:pPr>
       <w:r>
-        <w:t>Pruebas de controllers para codigos 201, 400, 404 y 204.</w:t>
+        <w:t>El comando mvn clean verify genera target/site/jacoco/index.html y target/site/jacoco/jacoco.xml.</w:t>
       </w:r>
     </w:p>
     <w:p>
@@ -2582,7 +2750,7 @@
         <w:pStyle w:val="ListBullet"/>
       </w:pPr>
       <w:r>
-        <w:t>Pruebas de repositories con H2 para solapamientos y filtros.</w:t>
+        <w:t>Cobertura actual: lineas 74.69%, instrucciones 68.83% y clases 100%.</w:t>
       </w:r>
     </w:p>
     <w:p>
@@ -2590,7 +2758,7 @@
         <w:pStyle w:val="ListBullet"/>
       </w:pPr>
       <w:r>
-        <w:t>Pruebas especificas de ReporteCitasService.</w:t>
+        <w:t>SonarQube queda preparado con sonar-project.properties para revisar complejidad, duplicacion y deuda tecnica.</w:t>
       </w:r>
     </w:p>
     <w:p>
@@ -2598,15 +2766,7 @@
         <w:pStyle w:val="ListBullet"/>
       </w:pPr>
       <w:r>
-        <w:t>Configurar JaCoCo para cobertura.</w:t>
-      </w:r>
-    </w:p>
-    <w:p>
-      <w:pPr>
-        <w:pStyle w:val="ListBullet"/>
-      </w:pPr>
-      <w:r>
-        <w:t>Analisis SonarQube para complejidad ciclomatica, duplicacion y deuda tecnica.</w:t>
+        <w:t>La ejecucion de SonarQube requiere servidor local o SonarCloud y un token valido.</w:t>
       </w:r>
     </w:p>
     <w:p>

</xml_diff>